<commit_message>
part4 finished -> see plots
</commit_message>
<xml_diff>
--- a/Lab3/Evaluation_Part4.docx
+++ b/Lab3/Evaluation_Part4.docx
@@ -2,6 +2,265 @@
 <file path=word/document.xml><?xml version="1.0" encoding="utf-8"?>
 <w:document xmlns:wpc="http://schemas.microsoft.com/office/word/2010/wordprocessingCanvas" xmlns:cx="http://schemas.microsoft.com/office/drawing/2014/chartex" xmlns:cx1="http://schemas.microsoft.com/office/drawing/2015/9/8/chartex" xmlns:cx2="http://schemas.microsoft.com/office/drawing/2015/10/21/chartex" xmlns:cx3="http://schemas.microsoft.com/office/drawing/2016/5/9/chartex" xmlns:cx4="http://schemas.microsoft.com/office/drawing/2016/5/10/chartex" xmlns:cx5="http://schemas.microsoft.com/office/drawing/2016/5/11/chartex" xmlns:cx6="http://schemas.microsoft.com/office/drawing/2016/5/12/chartex" xmlns:cx7="http://schemas.microsoft.com/office/drawing/2016/5/13/chartex" xmlns:cx8="http://schemas.microsoft.com/office/drawing/2016/5/14/chartex" xmlns:mc="http://schemas.openxmlformats.org/markup-compatibility/2006" xmlns:aink="http://schemas.microsoft.com/office/drawing/2016/ink" xmlns:am3d="http://schemas.microsoft.com/office/drawing/2017/model3d" xmlns:o="urn:schemas-microsoft-com:office:office" xmlns:oel="http://schemas.microsoft.com/office/2019/extlst" xmlns:r="http://schemas.openxmlformats.org/officeDocument/2006/relationships" xmlns:m="http://schemas.openxmlformats.org/officeDocument/2006/math" xmlns:v="urn:schemas-microsoft-com:vml" xmlns:wp14="http://schemas.microsoft.com/office/word/2010/wordprocessingDrawing" xmlns:wp="http://schemas.openxmlformats.org/drawingml/2006/wordprocessingDrawing" xmlns:w10="urn:schemas-microsoft-com:office:word" xmlns:w="http://schemas.openxmlformats.org/wordprocessingml/2006/main" xmlns:w14="http://schemas.microsoft.com/office/word/2010/wordml" xmlns:w15="http://schemas.microsoft.com/office/word/2012/wordml" xmlns:w16cex="http://schemas.microsoft.com/office/word/2018/wordml/cex" xmlns:w16cid="http://schemas.microsoft.com/office/word/2016/wordml/cid" xmlns:w16="http://schemas.microsoft.com/office/word/2018/wordml" xmlns:w16du="http://schemas.microsoft.com/office/word/2023/wordml/word16du" xmlns:w16sdtdh="http://schemas.microsoft.com/office/word/2020/wordml/sdtdatahash" xmlns:w16sdtfl="http://schemas.microsoft.com/office/word/2024/wordml/sdtformatlock" xmlns:w16se="http://schemas.microsoft.com/office/word/2015/wordml/symex" xmlns:wpg="http://schemas.microsoft.com/office/word/2010/wordprocessingGroup" xmlns:wpi="http://schemas.microsoft.com/office/word/2010/wordprocessingInk" xmlns:wne="http://schemas.microsoft.com/office/word/2006/wordml" xmlns:wps="http://schemas.microsoft.com/office/word/2010/wordprocessingShape" mc:Ignorable="w14 w15 w16se w16cid w16 w16cex w16sdtdh w16sdtfl w16du wp14">
   <w:body>
+    <w:p>
+      <w:r>
+        <w:rPr>
+          <w:b/>
+          <w:bCs/>
+        </w:rPr>
+        <w:t>Question 1:</w:t>
+      </w:r>
+      <w:r>
+        <w:t xml:space="preserve"> </w:t>
+      </w:r>
+      <w:r>
+        <w:t>How reliable is the communication between the devices? Do you experience any packet loss or delays? If so, under what conditions?</w:t>
+      </w:r>
+    </w:p>
+    <w:p>
+      <w:r>
+        <w:t>The communication between the client and the server was highly reliable during the experiment. As shown in the reliability plot, 100% of the CoAP requests sent by the client were received by the server and 100% of the server responses were successfully acknowledged by the client.</w:t>
+      </w:r>
+    </w:p>
+    <w:p>
+      <w:r>
+        <w:t>No packet loss, failed CoAP transactions or communication interruptions were observed during the measurement period. Every request resulted in a corresponding CoAP ACK response.</w:t>
+      </w:r>
+    </w:p>
+    <w:p>
+      <w:r>
+        <w:t>The measurements were performed under normal laboratory conditions with a short distance between the devices and without intentional interference.</w:t>
+      </w:r>
+    </w:p>
+    <w:p>
+      <w:r>
+        <w:rPr>
+          <w:b/>
+          <w:bCs/>
+        </w:rPr>
+        <w:t>Result:</w:t>
+      </w:r>
+    </w:p>
+    <w:p>
+      <w:pPr>
+        <w:numPr>
+          <w:ilvl w:val="0"/>
+          <w:numId w:val="1"/>
+        </w:numPr>
+      </w:pPr>
+      <w:r>
+        <w:t xml:space="preserve">Packet loss: 0% </w:t>
+      </w:r>
+    </w:p>
+    <w:p>
+      <w:pPr>
+        <w:numPr>
+          <w:ilvl w:val="0"/>
+          <w:numId w:val="1"/>
+        </w:numPr>
+      </w:pPr>
+      <w:r>
+        <w:t xml:space="preserve">Successful request delivery: 100% </w:t>
+      </w:r>
+    </w:p>
+    <w:p>
+      <w:pPr>
+        <w:numPr>
+          <w:ilvl w:val="0"/>
+          <w:numId w:val="1"/>
+        </w:numPr>
+      </w:pPr>
+      <w:r>
+        <w:t xml:space="preserve">Successful response delivery: 100% </w:t>
+      </w:r>
+    </w:p>
+    <w:p>
+      <w:pPr>
+        <w:rPr>
+          <w:b/>
+          <w:bCs/>
+        </w:rPr>
+      </w:pPr>
+    </w:p>
+    <w:p>
+      <w:r>
+        <w:rPr>
+          <w:b/>
+          <w:bCs/>
+        </w:rPr>
+        <w:t>Question 2</w:t>
+      </w:r>
+      <w:r>
+        <w:rPr>
+          <w:b/>
+          <w:bCs/>
+        </w:rPr>
+        <w:t xml:space="preserve">: </w:t>
+      </w:r>
+      <w:r>
+        <w:t>What is the average round-trip time (RTT) between a CoAP request and the corresponding response?</w:t>
+      </w:r>
+    </w:p>
+    <w:p>
+      <w:r>
+        <w:t>The RTT measurements show a very stable communication latency. Most requests resulted in an RTT of approximately 14 ms, while only a few measurements reached 15 ms.</w:t>
+      </w:r>
+    </w:p>
+    <w:p>
+      <w:r>
+        <w:t>The RTT-over-time plot demonstrates that the latency remained nearly constant throughout the entire experiment</w:t>
+      </w:r>
+      <w:r>
+        <w:t xml:space="preserve"> and</w:t>
+      </w:r>
+      <w:r>
+        <w:t xml:space="preserve"> remained within a very narrow range between 13 ms and 15 m</w:t>
+      </w:r>
+      <w:r>
+        <w:t>s</w:t>
+      </w:r>
+      <w:r>
+        <w:t>.</w:t>
+      </w:r>
+    </w:p>
+    <w:p>
+      <w:r>
+        <w:t>Based on the collected measurements:</w:t>
+      </w:r>
+    </w:p>
+    <w:p>
+      <w:pPr>
+        <w:numPr>
+          <w:ilvl w:val="0"/>
+          <w:numId w:val="2"/>
+        </w:numPr>
+      </w:pPr>
+      <w:r>
+        <w:t>Minimum RTT: 1</w:t>
+      </w:r>
+      <w:r>
+        <w:t>3</w:t>
+      </w:r>
+      <w:r>
+        <w:t xml:space="preserve"> ms </w:t>
+      </w:r>
+    </w:p>
+    <w:p>
+      <w:pPr>
+        <w:numPr>
+          <w:ilvl w:val="0"/>
+          <w:numId w:val="2"/>
+        </w:numPr>
+      </w:pPr>
+      <w:r>
+        <w:t xml:space="preserve">Maximum RTT: 15 ms </w:t>
+      </w:r>
+    </w:p>
+    <w:p>
+      <w:pPr>
+        <w:numPr>
+          <w:ilvl w:val="0"/>
+          <w:numId w:val="2"/>
+        </w:numPr>
+      </w:pPr>
+      <w:r>
+        <w:t xml:space="preserve">Average RTT: approximately 14 ms </w:t>
+      </w:r>
+    </w:p>
+    <w:p>
+      <w:pPr>
+        <w:numPr>
+          <w:ilvl w:val="0"/>
+          <w:numId w:val="2"/>
+        </w:numPr>
+      </w:pPr>
+      <w:r>
+        <w:t xml:space="preserve">RTT variation: </w:t>
+      </w:r>
+      <w:r>
+        <w:t xml:space="preserve">+- </w:t>
+      </w:r>
+      <w:r>
+        <w:t xml:space="preserve">1 ms </w:t>
+      </w:r>
+    </w:p>
+    <w:p>
+      <w:r>
+        <w:t>This indicates a deterministic and predictable communication behavior.</w:t>
+      </w:r>
+    </w:p>
+    <w:p/>
+    <w:p>
+      <w:r>
+        <w:rPr>
+          <w:b/>
+          <w:bCs/>
+        </w:rPr>
+        <w:t>Question 3:</w:t>
+      </w:r>
+      <w:r>
+        <w:t xml:space="preserve"> </w:t>
+      </w:r>
+      <w:r>
+        <w:t>Does the triggering of the action endpoint work reliably? Does it feel responsive?</w:t>
+      </w:r>
+    </w:p>
+    <w:p>
+      <w:r>
+        <w:t>The action endpoint operated reliably during all performed tests.</w:t>
+      </w:r>
+    </w:p>
+    <w:p>
+      <w:r>
+        <w:t>Whenever the button was pressed on the client device, a POST request was sent to the server and the server successfully toggled the internal action state. The corresponding response was received by the client without any failed transactions.</w:t>
+      </w:r>
+    </w:p>
+    <w:p>
+      <w:r>
+        <w:t>No noticeable delay was perceived between pressing the button and receiving the response. Since the measured RTT is approximately 14 ms, the network-induced delay is effectively imperceptible to the user.</w:t>
+      </w:r>
+    </w:p>
+    <w:p/>
+    <w:p>
+      <w:r>
+        <w:rPr>
+          <w:b/>
+          <w:bCs/>
+        </w:rPr>
+        <w:lastRenderedPageBreak/>
+        <w:t xml:space="preserve">Question </w:t>
+      </w:r>
+      <w:r>
+        <w:rPr>
+          <w:b/>
+          <w:bCs/>
+        </w:rPr>
+        <w:t xml:space="preserve">4: </w:t>
+      </w:r>
+      <w:r>
+        <w:t>How does IEEE 802.15.4 + CoAP compare conceptually to BLE communication regarding complexity, reliability and responsiveness?</w:t>
+      </w:r>
+    </w:p>
+    <w:p>
+      <w:r>
+        <w:t>A quantitative comparison was not performed because the previous BLE implementation was only evaluated in Renode, whereas the IEEE 802.15.4 + CoAP implementation was evaluated on real hardware.</w:t>
+      </w:r>
+    </w:p>
+    <w:p>
+      <w:r>
+        <w:t>Conceptually, IEEE 802.15.4 combined with IPv6, UDP and CoAP provides a more Internet-oriented architecture. Devices can communicate using standard IP-based protocols, which simplifies integration into larger IoT networks.</w:t>
+      </w:r>
+    </w:p>
+    <w:p>
+      <w:r>
+        <w:t>BLE communication is generally simpler to set up for point-to-point communication and typically consumes less protocol overhead. However, it does not natively provide IP connectivity in the same way as a 6LoWPAN-based IEEE 802.15.4 network.</w:t>
+      </w:r>
+    </w:p>
+    <w:p>
+      <w:r>
+        <w:t>Based on the measurements performed in this lab, the IEEE 802.15.4 + CoAP solution demonstrated reliable communication and low latency on real hardware.</w:t>
+      </w:r>
+    </w:p>
     <w:p/>
     <w:sectPr>
       <w:pgSz w:w="11906" w:h="16838"/>
@@ -11,6 +270,315 @@
     </w:sectPr>
   </w:body>
 </w:document>
+</file>
+
+<file path=word/numbering.xml><?xml version="1.0" encoding="utf-8"?>
+<w:numbering xmlns:wpc="http://schemas.microsoft.com/office/word/2010/wordprocessingCanvas" xmlns:cx="http://schemas.microsoft.com/office/drawing/2014/chartex" xmlns:cx1="http://schemas.microsoft.com/office/drawing/2015/9/8/chartex" xmlns:cx2="http://schemas.microsoft.com/office/drawing/2015/10/21/chartex" xmlns:cx3="http://schemas.microsoft.com/office/drawing/2016/5/9/chartex" xmlns:cx4="http://schemas.microsoft.com/office/drawing/2016/5/10/chartex" xmlns:cx5="http://schemas.microsoft.com/office/drawing/2016/5/11/chartex" xmlns:cx6="http://schemas.microsoft.com/office/drawing/2016/5/12/chartex" xmlns:cx7="http://schemas.microsoft.com/office/drawing/2016/5/13/chartex" xmlns:cx8="http://schemas.microsoft.com/office/drawing/2016/5/14/chartex" xmlns:mc="http://schemas.openxmlformats.org/markup-compatibility/2006" xmlns:aink="http://schemas.microsoft.com/office/drawing/2016/ink" xmlns:am3d="http://schemas.microsoft.com/office/drawing/2017/model3d" xmlns:o="urn:schemas-microsoft-com:office:office" xmlns:oel="http://schemas.microsoft.com/office/2019/extlst" xmlns:r="http://schemas.openxmlformats.org/officeDocument/2006/relationships" xmlns:m="http://schemas.openxmlformats.org/officeDocument/2006/math" xmlns:v="urn:schemas-microsoft-com:vml" xmlns:wp14="http://schemas.microsoft.com/office/word/2010/wordprocessingDrawing" xmlns:wp="http://schemas.openxmlformats.org/drawingml/2006/wordprocessingDrawing" xmlns:w10="urn:schemas-microsoft-com:office:word" xmlns:w="http://schemas.openxmlformats.org/wordprocessingml/2006/main" xmlns:w14="http://schemas.microsoft.com/office/word/2010/wordml" xmlns:w15="http://schemas.microsoft.com/office/word/2012/wordml" xmlns:w16cex="http://schemas.microsoft.com/office/word/2018/wordml/cex" xmlns:w16cid="http://schemas.microsoft.com/office/word/2016/wordml/cid" xmlns:w16="http://schemas.microsoft.com/office/word/2018/wordml" xmlns:w16du="http://schemas.microsoft.com/office/word/2023/wordml/word16du" xmlns:w16sdtdh="http://schemas.microsoft.com/office/word/2020/wordml/sdtdatahash" xmlns:w16sdtfl="http://schemas.microsoft.com/office/word/2024/wordml/sdtformatlock" xmlns:w16se="http://schemas.microsoft.com/office/word/2015/wordml/symex" xmlns:wpg="http://schemas.microsoft.com/office/word/2010/wordprocessingGroup" xmlns:wpi="http://schemas.microsoft.com/office/word/2010/wordprocessingInk" xmlns:wne="http://schemas.microsoft.com/office/word/2006/wordml" xmlns:wps="http://schemas.microsoft.com/office/word/2010/wordprocessingShape" mc:Ignorable="w14 w15 w16se w16cid w16 w16cex w16sdtdh w16sdtfl w16du wp14">
+  <w:abstractNum w:abstractNumId="0" w15:restartNumberingAfterBreak="0">
+    <w:nsid w:val="16A72993"/>
+    <w:multiLevelType w:val="multilevel"/>
+    <w:tmpl w:val="2B94353E"/>
+    <w:lvl w:ilvl="0">
+      <w:start w:val="1"/>
+      <w:numFmt w:val="bullet"/>
+      <w:lvlText w:val=""/>
+      <w:lvlJc w:val="left"/>
+      <w:pPr>
+        <w:tabs>
+          <w:tab w:val="num" w:pos="720"/>
+        </w:tabs>
+        <w:ind w:left="720" w:hanging="360"/>
+      </w:pPr>
+      <w:rPr>
+        <w:rFonts w:ascii="Symbol" w:hAnsi="Symbol" w:hint="default"/>
+        <w:sz w:val="20"/>
+      </w:rPr>
+    </w:lvl>
+    <w:lvl w:ilvl="1" w:tentative="1">
+      <w:start w:val="1"/>
+      <w:numFmt w:val="bullet"/>
+      <w:lvlText w:val="o"/>
+      <w:lvlJc w:val="left"/>
+      <w:pPr>
+        <w:tabs>
+          <w:tab w:val="num" w:pos="1440"/>
+        </w:tabs>
+        <w:ind w:left="1440" w:hanging="360"/>
+      </w:pPr>
+      <w:rPr>
+        <w:rFonts w:ascii="Courier New" w:hAnsi="Courier New" w:hint="default"/>
+        <w:sz w:val="20"/>
+      </w:rPr>
+    </w:lvl>
+    <w:lvl w:ilvl="2" w:tentative="1">
+      <w:start w:val="1"/>
+      <w:numFmt w:val="bullet"/>
+      <w:lvlText w:val=""/>
+      <w:lvlJc w:val="left"/>
+      <w:pPr>
+        <w:tabs>
+          <w:tab w:val="num" w:pos="2160"/>
+        </w:tabs>
+        <w:ind w:left="2160" w:hanging="360"/>
+      </w:pPr>
+      <w:rPr>
+        <w:rFonts w:ascii="Wingdings" w:hAnsi="Wingdings" w:hint="default"/>
+        <w:sz w:val="20"/>
+      </w:rPr>
+    </w:lvl>
+    <w:lvl w:ilvl="3" w:tentative="1">
+      <w:start w:val="1"/>
+      <w:numFmt w:val="bullet"/>
+      <w:lvlText w:val=""/>
+      <w:lvlJc w:val="left"/>
+      <w:pPr>
+        <w:tabs>
+          <w:tab w:val="num" w:pos="2880"/>
+        </w:tabs>
+        <w:ind w:left="2880" w:hanging="360"/>
+      </w:pPr>
+      <w:rPr>
+        <w:rFonts w:ascii="Wingdings" w:hAnsi="Wingdings" w:hint="default"/>
+        <w:sz w:val="20"/>
+      </w:rPr>
+    </w:lvl>
+    <w:lvl w:ilvl="4" w:tentative="1">
+      <w:start w:val="1"/>
+      <w:numFmt w:val="bullet"/>
+      <w:lvlText w:val=""/>
+      <w:lvlJc w:val="left"/>
+      <w:pPr>
+        <w:tabs>
+          <w:tab w:val="num" w:pos="3600"/>
+        </w:tabs>
+        <w:ind w:left="3600" w:hanging="360"/>
+      </w:pPr>
+      <w:rPr>
+        <w:rFonts w:ascii="Wingdings" w:hAnsi="Wingdings" w:hint="default"/>
+        <w:sz w:val="20"/>
+      </w:rPr>
+    </w:lvl>
+    <w:lvl w:ilvl="5" w:tentative="1">
+      <w:start w:val="1"/>
+      <w:numFmt w:val="bullet"/>
+      <w:lvlText w:val=""/>
+      <w:lvlJc w:val="left"/>
+      <w:pPr>
+        <w:tabs>
+          <w:tab w:val="num" w:pos="4320"/>
+        </w:tabs>
+        <w:ind w:left="4320" w:hanging="360"/>
+      </w:pPr>
+      <w:rPr>
+        <w:rFonts w:ascii="Wingdings" w:hAnsi="Wingdings" w:hint="default"/>
+        <w:sz w:val="20"/>
+      </w:rPr>
+    </w:lvl>
+    <w:lvl w:ilvl="6" w:tentative="1">
+      <w:start w:val="1"/>
+      <w:numFmt w:val="bullet"/>
+      <w:lvlText w:val=""/>
+      <w:lvlJc w:val="left"/>
+      <w:pPr>
+        <w:tabs>
+          <w:tab w:val="num" w:pos="5040"/>
+        </w:tabs>
+        <w:ind w:left="5040" w:hanging="360"/>
+      </w:pPr>
+      <w:rPr>
+        <w:rFonts w:ascii="Wingdings" w:hAnsi="Wingdings" w:hint="default"/>
+        <w:sz w:val="20"/>
+      </w:rPr>
+    </w:lvl>
+    <w:lvl w:ilvl="7" w:tentative="1">
+      <w:start w:val="1"/>
+      <w:numFmt w:val="bullet"/>
+      <w:lvlText w:val=""/>
+      <w:lvlJc w:val="left"/>
+      <w:pPr>
+        <w:tabs>
+          <w:tab w:val="num" w:pos="5760"/>
+        </w:tabs>
+        <w:ind w:left="5760" w:hanging="360"/>
+      </w:pPr>
+      <w:rPr>
+        <w:rFonts w:ascii="Wingdings" w:hAnsi="Wingdings" w:hint="default"/>
+        <w:sz w:val="20"/>
+      </w:rPr>
+    </w:lvl>
+    <w:lvl w:ilvl="8" w:tentative="1">
+      <w:start w:val="1"/>
+      <w:numFmt w:val="bullet"/>
+      <w:lvlText w:val=""/>
+      <w:lvlJc w:val="left"/>
+      <w:pPr>
+        <w:tabs>
+          <w:tab w:val="num" w:pos="6480"/>
+        </w:tabs>
+        <w:ind w:left="6480" w:hanging="360"/>
+      </w:pPr>
+      <w:rPr>
+        <w:rFonts w:ascii="Wingdings" w:hAnsi="Wingdings" w:hint="default"/>
+        <w:sz w:val="20"/>
+      </w:rPr>
+    </w:lvl>
+  </w:abstractNum>
+  <w:abstractNum w:abstractNumId="1" w15:restartNumberingAfterBreak="0">
+    <w:nsid w:val="568502FB"/>
+    <w:multiLevelType w:val="multilevel"/>
+    <w:tmpl w:val="EDEE61EE"/>
+    <w:lvl w:ilvl="0">
+      <w:start w:val="1"/>
+      <w:numFmt w:val="bullet"/>
+      <w:lvlText w:val=""/>
+      <w:lvlJc w:val="left"/>
+      <w:pPr>
+        <w:tabs>
+          <w:tab w:val="num" w:pos="720"/>
+        </w:tabs>
+        <w:ind w:left="720" w:hanging="360"/>
+      </w:pPr>
+      <w:rPr>
+        <w:rFonts w:ascii="Symbol" w:hAnsi="Symbol" w:hint="default"/>
+        <w:sz w:val="20"/>
+      </w:rPr>
+    </w:lvl>
+    <w:lvl w:ilvl="1" w:tentative="1">
+      <w:start w:val="1"/>
+      <w:numFmt w:val="bullet"/>
+      <w:lvlText w:val="o"/>
+      <w:lvlJc w:val="left"/>
+      <w:pPr>
+        <w:tabs>
+          <w:tab w:val="num" w:pos="1440"/>
+        </w:tabs>
+        <w:ind w:left="1440" w:hanging="360"/>
+      </w:pPr>
+      <w:rPr>
+        <w:rFonts w:ascii="Courier New" w:hAnsi="Courier New" w:hint="default"/>
+        <w:sz w:val="20"/>
+      </w:rPr>
+    </w:lvl>
+    <w:lvl w:ilvl="2" w:tentative="1">
+      <w:start w:val="1"/>
+      <w:numFmt w:val="bullet"/>
+      <w:lvlText w:val=""/>
+      <w:lvlJc w:val="left"/>
+      <w:pPr>
+        <w:tabs>
+          <w:tab w:val="num" w:pos="2160"/>
+        </w:tabs>
+        <w:ind w:left="2160" w:hanging="360"/>
+      </w:pPr>
+      <w:rPr>
+        <w:rFonts w:ascii="Wingdings" w:hAnsi="Wingdings" w:hint="default"/>
+        <w:sz w:val="20"/>
+      </w:rPr>
+    </w:lvl>
+    <w:lvl w:ilvl="3" w:tentative="1">
+      <w:start w:val="1"/>
+      <w:numFmt w:val="bullet"/>
+      <w:lvlText w:val=""/>
+      <w:lvlJc w:val="left"/>
+      <w:pPr>
+        <w:tabs>
+          <w:tab w:val="num" w:pos="2880"/>
+        </w:tabs>
+        <w:ind w:left="2880" w:hanging="360"/>
+      </w:pPr>
+      <w:rPr>
+        <w:rFonts w:ascii="Wingdings" w:hAnsi="Wingdings" w:hint="default"/>
+        <w:sz w:val="20"/>
+      </w:rPr>
+    </w:lvl>
+    <w:lvl w:ilvl="4" w:tentative="1">
+      <w:start w:val="1"/>
+      <w:numFmt w:val="bullet"/>
+      <w:lvlText w:val=""/>
+      <w:lvlJc w:val="left"/>
+      <w:pPr>
+        <w:tabs>
+          <w:tab w:val="num" w:pos="3600"/>
+        </w:tabs>
+        <w:ind w:left="3600" w:hanging="360"/>
+      </w:pPr>
+      <w:rPr>
+        <w:rFonts w:ascii="Wingdings" w:hAnsi="Wingdings" w:hint="default"/>
+        <w:sz w:val="20"/>
+      </w:rPr>
+    </w:lvl>
+    <w:lvl w:ilvl="5" w:tentative="1">
+      <w:start w:val="1"/>
+      <w:numFmt w:val="bullet"/>
+      <w:lvlText w:val=""/>
+      <w:lvlJc w:val="left"/>
+      <w:pPr>
+        <w:tabs>
+          <w:tab w:val="num" w:pos="4320"/>
+        </w:tabs>
+        <w:ind w:left="4320" w:hanging="360"/>
+      </w:pPr>
+      <w:rPr>
+        <w:rFonts w:ascii="Wingdings" w:hAnsi="Wingdings" w:hint="default"/>
+        <w:sz w:val="20"/>
+      </w:rPr>
+    </w:lvl>
+    <w:lvl w:ilvl="6" w:tentative="1">
+      <w:start w:val="1"/>
+      <w:numFmt w:val="bullet"/>
+      <w:lvlText w:val=""/>
+      <w:lvlJc w:val="left"/>
+      <w:pPr>
+        <w:tabs>
+          <w:tab w:val="num" w:pos="5040"/>
+        </w:tabs>
+        <w:ind w:left="5040" w:hanging="360"/>
+      </w:pPr>
+      <w:rPr>
+        <w:rFonts w:ascii="Wingdings" w:hAnsi="Wingdings" w:hint="default"/>
+        <w:sz w:val="20"/>
+      </w:rPr>
+    </w:lvl>
+    <w:lvl w:ilvl="7" w:tentative="1">
+      <w:start w:val="1"/>
+      <w:numFmt w:val="bullet"/>
+      <w:lvlText w:val=""/>
+      <w:lvlJc w:val="left"/>
+      <w:pPr>
+        <w:tabs>
+          <w:tab w:val="num" w:pos="5760"/>
+        </w:tabs>
+        <w:ind w:left="5760" w:hanging="360"/>
+      </w:pPr>
+      <w:rPr>
+        <w:rFonts w:ascii="Wingdings" w:hAnsi="Wingdings" w:hint="default"/>
+        <w:sz w:val="20"/>
+      </w:rPr>
+    </w:lvl>
+    <w:lvl w:ilvl="8" w:tentative="1">
+      <w:start w:val="1"/>
+      <w:numFmt w:val="bullet"/>
+      <w:lvlText w:val=""/>
+      <w:lvlJc w:val="left"/>
+      <w:pPr>
+        <w:tabs>
+          <w:tab w:val="num" w:pos="6480"/>
+        </w:tabs>
+        <w:ind w:left="6480" w:hanging="360"/>
+      </w:pPr>
+      <w:rPr>
+        <w:rFonts w:ascii="Wingdings" w:hAnsi="Wingdings" w:hint="default"/>
+        <w:sz w:val="20"/>
+      </w:rPr>
+    </w:lvl>
+  </w:abstractNum>
+  <w:num w:numId="1" w16cid:durableId="1995375708">
+    <w:abstractNumId w:val="0"/>
+  </w:num>
+  <w:num w:numId="2" w16cid:durableId="624241960">
+    <w:abstractNumId w:val="1"/>
+  </w:num>
+</w:numbering>
 </file>
 
 <file path=word/styles.xml><?xml version="1.0" encoding="utf-8"?>
@@ -614,7 +1182,6 @@
   <w:style w:type="character" w:default="1" w:styleId="Absatz-Standardschriftart">
     <w:name w:val="Default Paragraph Font"/>
     <w:uiPriority w:val="1"/>
-    <w:semiHidden/>
     <w:unhideWhenUsed/>
   </w:style>
   <w:style w:type="table" w:default="1" w:styleId="NormaleTabelle">

</xml_diff>